<commit_message>
Fix onboarding-pack document content, add admin pre-fill, and position sign boxes correctly
Letter of Engagement (and 4 other staff onboarding documents) had stale hardcoded
years baked into the static text and no worker name/address merge tags at all,
even though the merge data was already being built for every send — the
templates just never referenced it. Also added admin-fillable fields
(remuneration rate, pay frequency, governing state, commencement/end dates) with
a sequential "prepare documents" step before sending, and hand-positioned every
signature/date box against the real rendered PDF instead of the generic
one-size-fits-all fallback position.
</commit_message>
<xml_diff>
--- a/server/templates/library/independent-contractor-agreement-including-cover-letter-induction-checklists-and-worker-declarations/template.docx
+++ b/server/templates/library/independent-contractor-agreement-including-cover-letter-induction-checklists-and-worker-declarations/template.docx
@@ -48,20 +48,18 @@
         <w:rPr>
           <w:rtl w:val="0"/>
         </w:rPr>
-        <w:t xml:space="preserve"> &lt;</w:t>
+        <w:t xml:space="preserve"> {staff.full_name} </w:t>
       </w:r>
       <w:r>
         <w:rPr>
           <w:color w:val="d9d9d9"/>
           <w:rtl w:val="0"/>
         </w:rPr>
-        <w:t xml:space="preserve"> insert contractor name</w:t>
-      </w:r>
-      <w:r>
-        <w:rPr>
-          <w:rtl w:val="0"/>
-        </w:rPr>
-        <w:t xml:space="preserve"> &gt; </w:t>
+      </w:r>
+      <w:r>
+        <w:rPr>
+          <w:rtl w:val="0"/>
+        </w:rPr>
       </w:r>
       <w:r>
         <w:rPr>
@@ -136,20 +134,18 @@
         <w:rPr>
           <w:rtl w:val="0"/>
         </w:rPr>
-        <w:t xml:space="preserve">&lt; </w:t>
+        <w:t>{staff.address}</w:t>
       </w:r>
       <w:r>
         <w:rPr>
           <w:color w:val="d9d9d9"/>
           <w:rtl w:val="0"/>
         </w:rPr>
-        <w:t>insert Contractor_Address</w:t>
-      </w:r>
-      <w:r>
-        <w:rPr>
-          <w:rtl w:val="0"/>
-        </w:rPr>
-        <w:t xml:space="preserve"> &gt;</w:t>
+      </w:r>
+      <w:r>
+        <w:rPr>
+          <w:rtl w:val="0"/>
+        </w:rPr>
       </w:r>
     </w:p>
     <w:p>
@@ -252,26 +248,23 @@
           <w:vertAlign w:val="baseline"/>
           <w:rtl w:val="0"/>
         </w:rPr>
-        <w:t xml:space="preserve">Dear </w:t>
-      </w:r>
-      <w:r>
-        <w:rPr>
-          <w:rtl w:val="0"/>
-        </w:rPr>
-        <w:t xml:space="preserve"> &lt;</w:t>
+        <w:t>Dear {staff.full_name}</w:t>
+      </w:r>
+      <w:r>
+        <w:rPr>
+          <w:rtl w:val="0"/>
+        </w:rPr>
       </w:r>
       <w:r>
         <w:rPr>
           <w:color w:val="d9d9d9"/>
           <w:rtl w:val="0"/>
         </w:rPr>
-        <w:t xml:space="preserve"> insert contractor name</w:t>
-      </w:r>
-      <w:r>
-        <w:rPr>
-          <w:rtl w:val="0"/>
-        </w:rPr>
-        <w:t xml:space="preserve"> &gt;</w:t>
+      </w:r>
+      <w:r>
+        <w:rPr>
+          <w:rtl w:val="0"/>
+        </w:rPr>
       </w:r>
       <w:r>
         <w:rPr>
@@ -934,26 +927,23 @@
           <w:b w:val="1"/>
           <w:rtl w:val="0"/>
         </w:rPr>
-        <w:t xml:space="preserve">Signed </w:t>
-      </w:r>
-      <w:r>
-        <w:rPr>
-          <w:rtl w:val="0"/>
-        </w:rPr>
-        <w:t>by: &lt;</w:t>
+        <w:t>Signed by: {staff.full_name}</w:t>
+      </w:r>
+      <w:r>
+        <w:rPr>
+          <w:rtl w:val="0"/>
+        </w:rPr>
       </w:r>
       <w:r>
         <w:rPr>
           <w:color w:val="d9d9d9"/>
           <w:rtl w:val="0"/>
         </w:rPr>
-        <w:t xml:space="preserve"> insert contractor name</w:t>
-      </w:r>
-      <w:r>
-        <w:rPr>
-          <w:rtl w:val="0"/>
-        </w:rPr>
-        <w:t xml:space="preserve"> &gt;</w:t>
+      </w:r>
+      <w:r>
+        <w:rPr>
+          <w:rtl w:val="0"/>
+        </w:rPr>
       </w:r>
     </w:p>
     <w:p>
@@ -11744,6 +11734,7 @@
               <w:rPr>
                 <w:rtl w:val="0"/>
               </w:rPr>
+              <w:t>{commencement_date}</w:t>
             </w:r>
           </w:p>
         </w:tc>
@@ -11917,6 +11908,7 @@
               <w:rPr>
                 <w:rtl w:val="0"/>
               </w:rPr>
+              <w:t>{end_date}</w:t>
             </w:r>
           </w:p>
         </w:tc>

</xml_diff>